<commit_message>
Atualiza README, relatorio, notebook principal e imagens SHAP (15, 16, 17); adiciona script projeto.bat
</commit_message>
<xml_diff>
--- a/Relatorio_Entrega.docx
+++ b/Relatorio_Entrega.docx
@@ -455,6 +455,7 @@
         <w:jc w:val="both"/>
         <w:rPr>
           <w:rFonts w:asciiTheme="minorHAnsi" w:hAnsiTheme="minorHAnsi" w:cstheme="minorHAnsi"/>
+          <w:lang w:val="en-US"/>
         </w:rPr>
       </w:pPr>
       <w:r>
@@ -468,6 +469,7 @@
         <w:t xml:space="preserve">Vídeo de </w:t>
       </w:r>
       <w:proofErr w:type="spellStart"/>
+      <w:proofErr w:type="gramStart"/>
       <w:r>
         <w:rPr>
           <w:rFonts w:asciiTheme="minorHAnsi" w:hAnsiTheme="minorHAnsi" w:cstheme="minorHAnsi"/>
@@ -487,52 +489,20 @@
           <w:sz w:val="20"/>
           <w:szCs w:val="20"/>
         </w:rPr>
-        <w:t>:</w:t>
-      </w:r>
-      <w:r>
-        <w:rPr>
-          <w:rFonts w:asciiTheme="minorHAnsi" w:hAnsiTheme="minorHAnsi" w:cstheme="minorHAnsi"/>
+        <w:t xml:space="preserve"> </w:t>
+      </w:r>
+      <w:r>
+        <w:rPr>
+          <w:rFonts w:asciiTheme="minorHAnsi" w:hAnsiTheme="minorHAnsi" w:cstheme="minorHAnsi"/>
+          <w:b/>
+          <w:bCs/>
           <w:sz w:val="20"/>
           <w:szCs w:val="20"/>
-        </w:rPr>
-        <w:t xml:space="preserve"> [inserir link </w:t>
-      </w:r>
-      <w:proofErr w:type="spellStart"/>
-      <w:r>
-        <w:rPr>
-          <w:rFonts w:asciiTheme="minorHAnsi" w:hAnsiTheme="minorHAnsi" w:cstheme="minorHAnsi"/>
-          <w:sz w:val="20"/>
-          <w:szCs w:val="20"/>
-        </w:rPr>
-        <w:t>após</w:t>
-      </w:r>
-      <w:proofErr w:type="spellEnd"/>
-      <w:r>
-        <w:rPr>
-          <w:rFonts w:asciiTheme="minorHAnsi" w:hAnsiTheme="minorHAnsi" w:cstheme="minorHAnsi"/>
-          <w:sz w:val="20"/>
-          <w:szCs w:val="20"/>
-        </w:rPr>
-        <w:t xml:space="preserve"> </w:t>
-      </w:r>
-      <w:proofErr w:type="spellStart"/>
-      <w:r>
-        <w:rPr>
-          <w:rFonts w:asciiTheme="minorHAnsi" w:hAnsiTheme="minorHAnsi" w:cstheme="minorHAnsi"/>
-          <w:sz w:val="20"/>
-          <w:szCs w:val="20"/>
-        </w:rPr>
-        <w:t>publicação</w:t>
-      </w:r>
-      <w:proofErr w:type="spellEnd"/>
-      <w:r>
-        <w:rPr>
-          <w:rFonts w:asciiTheme="minorHAnsi" w:hAnsiTheme="minorHAnsi" w:cstheme="minorHAnsi"/>
-          <w:sz w:val="20"/>
-          <w:szCs w:val="20"/>
-        </w:rPr>
-        <w:t xml:space="preserve"> no YouTube/Vimeo]</w:t>
-      </w:r>
+          <w:lang w:val="en-US"/>
+        </w:rPr>
+        <w:t>:</w:t>
+      </w:r>
+      <w:proofErr w:type="gramEnd"/>
     </w:p>
     <w:p>
       <w:pPr>

</xml_diff>